<commit_message>
Removed first and last name from personal information, removed email from personal info page web and mobile apps.
</commit_message>
<xml_diff>
--- a/client/public/privacy-en-US.docx
+++ b/client/public/privacy-en-US.docx
@@ -48,7 +48,14 @@
           <w:sz w:val="22"/>
           <w:szCs w:val="22"/>
         </w:rPr>
-        <w:t>.0</w:t>
+        <w:t>.</w:t>
+      </w:r>
+      <w:r>
+        <w:rPr>
+          <w:sz w:val="22"/>
+          <w:szCs w:val="22"/>
+        </w:rPr>
+        <w:t>1</w:t>
       </w:r>
     </w:p>
     <w:p>
@@ -61,14 +68,14 @@
           <w:sz w:val="22"/>
           <w:szCs w:val="22"/>
         </w:rPr>
-        <w:t xml:space="preserve">Effective Date: February </w:t>
+        <w:t xml:space="preserve">Effective Date: </w:t>
       </w:r>
       <w:r>
         <w:rPr>
           <w:sz w:val="22"/>
           <w:szCs w:val="22"/>
         </w:rPr>
-        <w:t>6</w:t>
+        <w:t>March 3</w:t>
       </w:r>
       <w:r>
         <w:rPr>
@@ -88,14 +95,14 @@
           <w:sz w:val="22"/>
           <w:szCs w:val="22"/>
         </w:rPr>
-        <w:t xml:space="preserve">Last Updated: February </w:t>
+        <w:t xml:space="preserve">Last Updated: </w:t>
       </w:r>
       <w:r>
         <w:rPr>
           <w:sz w:val="22"/>
           <w:szCs w:val="22"/>
         </w:rPr>
-        <w:t>6</w:t>
+        <w:t>March 3</w:t>
       </w:r>
       <w:r>
         <w:rPr>
@@ -276,25 +283,6 @@
           <w:b/>
           <w:bCs/>
         </w:rPr>
-        <w:t>Name</w:t>
-      </w:r>
-      <w:r>
-        <w:t xml:space="preserve"> - Your full legal name</w:t>
-      </w:r>
-    </w:p>
-    <w:p>
-      <w:pPr>
-        <w:pStyle w:val="ListParagraph"/>
-        <w:numPr>
-          <w:ilvl w:val="0"/>
-          <w:numId w:val="2"/>
-        </w:numPr>
-      </w:pPr>
-      <w:r>
-        <w:rPr>
-          <w:b/>
-          <w:bCs/>
-        </w:rPr>
         <w:t>Email Address</w:t>
       </w:r>
       <w:r>
@@ -317,7 +305,25 @@
         <w:t>Birth Date</w:t>
       </w:r>
       <w:r>
-        <w:t xml:space="preserve"> - Required for age verification (18+) and astrological calculations (YYYY-MM-DD format)</w:t>
+        <w:t xml:space="preserve"> - Required for age verification (18+) and astrological calculations (</w:t>
+      </w:r>
+      <w:r>
+        <w:t>DD</w:t>
+      </w:r>
+      <w:r>
+        <w:t>-MM</w:t>
+      </w:r>
+      <w:r>
+        <w:t>M</w:t>
+      </w:r>
+      <w:r>
+        <w:t>-</w:t>
+      </w:r>
+      <w:r>
+        <w:t xml:space="preserve">YYYY </w:t>
+      </w:r>
+      <w:r>
+        <w:t>format)</w:t>
       </w:r>
     </w:p>
     <w:p>
@@ -342,11 +348,28 @@
     <w:p>
       <w:pPr>
         <w:pStyle w:val="ListParagraph"/>
-        <w:numPr>
-          <w:ilvl w:val="0"/>
-          <w:numId w:val="2"/>
-        </w:numPr>
-        <w:spacing w:after="240"/>
+        <w:ind w:left="720"/>
+      </w:pPr>
+    </w:p>
+    <w:p>
+      <w:pPr>
+        <w:spacing w:after="120"/>
+      </w:pPr>
+      <w:r>
+        <w:rPr>
+          <w:b/>
+          <w:bCs/>
+        </w:rPr>
+        <w:t>Optional Information for Enhanced Astrological Services:</w:t>
+      </w:r>
+    </w:p>
+    <w:p>
+      <w:pPr>
+        <w:pStyle w:val="ListParagraph"/>
+        <w:numPr>
+          <w:ilvl w:val="0"/>
+          <w:numId w:val="2"/>
+        </w:numPr>
       </w:pPr>
       <w:r>
         <w:rPr>
@@ -357,18 +380,6 @@
       </w:r>
       <w:r>
         <w:t xml:space="preserve"> - Your preferred name or how you'd like to be addressed in the app</w:t>
-      </w:r>
-    </w:p>
-    <w:p>
-      <w:pPr>
-        <w:spacing w:after="120"/>
-      </w:pPr>
-      <w:r>
-        <w:rPr>
-          <w:b/>
-          <w:bCs/>
-        </w:rPr>
-        <w:t>Optional Information for Enhanced Astrological Services:</w:t>
       </w:r>
     </w:p>
     <w:p>

</xml_diff>

<commit_message>
Updated privacy, updated compliance for only registered users
</commit_message>
<xml_diff>
--- a/client/public/privacy-en-US.docx
+++ b/client/public/privacy-en-US.docx
@@ -41,88 +41,81 @@
           <w:sz w:val="22"/>
           <w:szCs w:val="22"/>
         </w:rPr>
-        <w:t>3</w:t>
-      </w:r>
+        <w:t>4.0</w:t>
+      </w:r>
+    </w:p>
+    <w:p>
+      <w:pPr>
+        <w:spacing w:after="120"/>
+        <w:jc w:val="center"/>
+      </w:pPr>
       <w:r>
         <w:rPr>
           <w:sz w:val="22"/>
           <w:szCs w:val="22"/>
         </w:rPr>
-        <w:t>.</w:t>
+        <w:t>Effective Date: March 3</w:t>
       </w:r>
       <w:r>
         <w:rPr>
           <w:sz w:val="22"/>
           <w:szCs w:val="22"/>
         </w:rPr>
-        <w:t>1</w:t>
-      </w:r>
-    </w:p>
-    <w:p>
-      <w:pPr>
-        <w:spacing w:after="120"/>
-        <w:jc w:val="center"/>
-      </w:pPr>
+        <w:t>0</w:t>
+      </w:r>
       <w:r>
         <w:rPr>
           <w:sz w:val="22"/>
           <w:szCs w:val="22"/>
         </w:rPr>
-        <w:t xml:space="preserve">Effective Date: </w:t>
-      </w:r>
+        <w:t>, 2026</w:t>
+      </w:r>
+    </w:p>
+    <w:p>
+      <w:pPr>
+        <w:spacing w:after="240"/>
+        <w:jc w:val="center"/>
+      </w:pPr>
       <w:r>
         <w:rPr>
           <w:sz w:val="22"/>
           <w:szCs w:val="22"/>
         </w:rPr>
-        <w:t>March 3</w:t>
+        <w:t>Last Updated: March 3</w:t>
       </w:r>
       <w:r>
         <w:rPr>
           <w:sz w:val="22"/>
           <w:szCs w:val="22"/>
         </w:rPr>
-        <w:t>, 2026</w:t>
-      </w:r>
-    </w:p>
-    <w:p>
-      <w:pPr>
-        <w:spacing w:after="240"/>
-        <w:jc w:val="center"/>
-      </w:pPr>
+        <w:t>0</w:t>
+      </w:r>
       <w:r>
         <w:rPr>
           <w:sz w:val="22"/>
           <w:szCs w:val="22"/>
         </w:rPr>
-        <w:t xml:space="preserve">Last Updated: </w:t>
-      </w:r>
+        <w:t>, 2026</w:t>
+      </w:r>
+    </w:p>
+    <w:p>
+      <w:pPr>
+        <w:spacing w:after="480"/>
+        <w:jc w:val="center"/>
+      </w:pPr>
       <w:r>
         <w:rPr>
           <w:sz w:val="22"/>
           <w:szCs w:val="22"/>
         </w:rPr>
-        <w:t>March 3</w:t>
+        <w:t>Jurisdiction: United States, Canada, Mexico</w:t>
       </w:r>
       <w:r>
         <w:rPr>
           <w:sz w:val="22"/>
           <w:szCs w:val="22"/>
         </w:rPr>
-        <w:t>, 2026</w:t>
-      </w:r>
-    </w:p>
-    <w:p>
-      <w:pPr>
-        <w:spacing w:after="480"/>
-        <w:jc w:val="center"/>
-      </w:pPr>
-      <w:r>
-        <w:rPr>
-          <w:sz w:val="22"/>
-          <w:szCs w:val="22"/>
-        </w:rPr>
-        <w:t>Jurisdiction: United States, Canada, Mexico</w:t>
+        <w:t>, Brazil</w:t>
       </w:r>
     </w:p>
     <w:p>
@@ -305,25 +298,7 @@
         <w:t>Birth Date</w:t>
       </w:r>
       <w:r>
-        <w:t xml:space="preserve"> - Required for age verification (18+) and astrological calculations (</w:t>
-      </w:r>
-      <w:r>
-        <w:t>DD</w:t>
-      </w:r>
-      <w:r>
-        <w:t>-MM</w:t>
-      </w:r>
-      <w:r>
-        <w:t>M</w:t>
-      </w:r>
-      <w:r>
-        <w:t>-</w:t>
-      </w:r>
-      <w:r>
-        <w:t xml:space="preserve">YYYY </w:t>
-      </w:r>
-      <w:r>
-        <w:t>format)</w:t>
+        <w:t xml:space="preserve"> - Required for age verification (18+) and astrological calculations (DD-MMM-YYYY format)</w:t>
       </w:r>
     </w:p>
     <w:p>
@@ -866,15 +841,7 @@
         <w:t>Birth Chart Calculations</w:t>
       </w:r>
       <w:r>
-        <w:t xml:space="preserve"> - To calculate your Sun, Moon, </w:t>
-      </w:r>
-      <w:proofErr w:type="gramStart"/>
-      <w:r>
-        <w:t>Rising</w:t>
-      </w:r>
-      <w:proofErr w:type="gramEnd"/>
-      <w:r>
-        <w:t xml:space="preserve"> signs, and complete birth chart using your birth date, time, and location</w:t>
+        <w:t xml:space="preserve"> - To calculate your Sun, Moon, Rising signs, and complete birth chart using your birth date, time, and location</w:t>
       </w:r>
     </w:p>
     <w:p>
@@ -1107,10 +1074,7 @@
         <w:spacing w:after="240"/>
       </w:pPr>
       <w:r>
-        <w:t>To respond to lawful requests from authorities</w:t>
-      </w:r>
-      <w:r>
-        <w:t xml:space="preserve"> and </w:t>
+        <w:t xml:space="preserve">To respond to lawful requests from authorities and </w:t>
       </w:r>
     </w:p>
     <w:p>
@@ -1124,15 +1088,7 @@
       </w:pPr>
       <w:r>
         <w:lastRenderedPageBreak/>
-        <w:t xml:space="preserve">To investigate, prevent, or take action regarding suspected illegal activity, threats to the safety of any person (including minors), violations of our Terms of Service or community policies, fraud, or security incidents, which may include retaining and disclosing relevant user-generated content and enforcement records </w:t>
-      </w:r>
-      <w:proofErr w:type="gramStart"/>
-      <w:r>
-        <w:t>where</w:t>
-      </w:r>
-      <w:proofErr w:type="gramEnd"/>
-      <w:r>
-        <w:t xml:space="preserve"> permitted or required by law</w:t>
+        <w:t>To investigate, prevent, or take action regarding suspected illegal activity, threats to the safety of any person (including minors), violations of our Terms of Service or community policies, fraud, or security incidents, which may include retaining and disclosing relevant user-generated content and enforcement records where permitted or required by law</w:t>
       </w:r>
     </w:p>
     <w:p>
@@ -1148,22 +1104,7 @@
         <w:spacing w:after="120"/>
       </w:pPr>
       <w:r>
-        <w:t>We use the following trusted third-party service providers to o</w:t>
-      </w:r>
-      <w:r>
-        <w:t xml:space="preserve">perate our Service. </w:t>
-      </w:r>
-      <w:r>
-        <w:t>We enter into written agreements with our service providers requiring them to use your personal information only to provide services to us, to keep it confidential, and to implement appropriate technical and organizational safeguards consistent with this Privacy Policy and applicable law</w:t>
-      </w:r>
-      <w:r>
-        <w:t xml:space="preserve">. </w:t>
-      </w:r>
-      <w:r>
-        <w:t xml:space="preserve">These </w:t>
-      </w:r>
-      <w:r>
-        <w:t>providers have access to your personal information only to perform specific tasks on our behalf and are obligated to protect your information:</w:t>
+        <w:t>We use the following trusted third-party service providers to operate our Service. We enter into written agreements with our service providers requiring them to use your personal information only to provide services to us, to keep it confidential, and to implement appropriate technical and organizational safeguards consistent with this Privacy Policy and applicable law. These providers have access to your personal information only to perform specific tasks on our behalf and are obligated to protect your information:</w:t>
       </w:r>
     </w:p>
     <w:tbl>
@@ -1297,7 +1238,7 @@
                 <w:b/>
                 <w:bCs/>
               </w:rPr>
-              <w:t>Stripe</w:t>
+              <w:t>Google/Apple</w:t>
             </w:r>
           </w:p>
         </w:tc>
@@ -1341,7 +1282,7 @@
           </w:tcPr>
           <w:p>
             <w:r>
-              <w:t>Payment method, billing address, transaction data</w:t>
+              <w:t>Subscription purchase</w:t>
             </w:r>
           </w:p>
         </w:tc>
@@ -1488,10 +1429,7 @@
           </w:tcPr>
           <w:p>
             <w:r>
-              <w:t>User inputs, chat messages, astrological profile data</w:t>
-            </w:r>
-            <w:r>
-              <w:t xml:space="preserve">.  </w:t>
+              <w:t xml:space="preserve">User inputs, chat messages, astrological profile data.  </w:t>
             </w:r>
             <w:r>
               <w:rPr>
@@ -1754,15 +1692,7 @@
               <w:right w:w="120" w:type="dxa"/>
             </w:tcMar>
           </w:tcPr>
-          <w:p>
-            <w:r>
-              <w:rPr>
-                <w:b/>
-                <w:bCs/>
-              </w:rPr>
-              <w:t>Redis</w:t>
-            </w:r>
-          </w:p>
+          <w:p/>
         </w:tc>
         <w:tc>
           <w:tcPr>
@@ -1780,11 +1710,7 @@
               <w:right w:w="120" w:type="dxa"/>
             </w:tcMar>
           </w:tcPr>
-          <w:p>
-            <w:r>
-              <w:t>Queue management and caching</w:t>
-            </w:r>
-          </w:p>
+          <w:p/>
         </w:tc>
         <w:tc>
           <w:tcPr>
@@ -1802,11 +1728,7 @@
               <w:right w:w="120" w:type="dxa"/>
             </w:tcMar>
           </w:tcPr>
-          <w:p>
-            <w:r>
-              <w:t>Temporary session data, processing queues</w:t>
-            </w:r>
-          </w:p>
+          <w:p/>
         </w:tc>
       </w:tr>
     </w:tbl>
@@ -1999,16 +1921,7 @@
         <w:t>Audit Logs</w:t>
       </w:r>
       <w:r>
-        <w:t xml:space="preserve"> - Retained for 7 years for financial, tax, and legal compliance purposes</w:t>
-      </w:r>
-      <w:r>
-        <w:t xml:space="preserve"> </w:t>
-      </w:r>
-      <w:r>
-        <w:t>i</w:t>
-      </w:r>
-      <w:r>
-        <w:t>ncluding records of suspected or confirmed policy violations, fraud prevention, and abuse of the Service. In some cases, we may retain specific records for longer where required by law or necessary to protect our rights or the rights and safety of others</w:t>
+        <w:t xml:space="preserve"> - Retained for 7 years for financial, tax, and legal compliance purposes including records of suspected or confirmed policy violations, fraud prevention, and abuse of the Service. In some cases, we may retain specific records for longer where required by law or necessary to protect our rights or the rights and safety of others</w:t>
       </w:r>
     </w:p>
     <w:p>
@@ -2028,7 +1941,13 @@
         <w:t>Payment Records</w:t>
       </w:r>
       <w:r>
-        <w:t xml:space="preserve"> - Retained by Stripe according to their retention policies and legal requirements</w:t>
+        <w:t xml:space="preserve"> - Retained by </w:t>
+      </w:r>
+      <w:r>
+        <w:t xml:space="preserve">Google/Apple </w:t>
+      </w:r>
+      <w:r>
+        <w:t>according to their retention policies and legal requirements</w:t>
       </w:r>
     </w:p>
     <w:p>
@@ -2289,16 +2208,7 @@
         <w:t>Right to Deletion</w:t>
       </w:r>
       <w:r>
-        <w:t xml:space="preserve"> - Request deletion of your account and personal information (subject to legal retention requirements</w:t>
-      </w:r>
-      <w:r>
-        <w:t xml:space="preserve"> </w:t>
-      </w:r>
-      <w:r>
-        <w:t>and our need to retain certain records for security, fraud prevention, and legal compliance, as described in Section 5</w:t>
-      </w:r>
-      <w:r>
-        <w:t>)</w:t>
+        <w:t xml:space="preserve"> - Request deletion of your account and personal information (subject to legal retention requirements and our need to retain certain records for security, fraud prevention, and legal compliance, as described in Section 5)</w:t>
       </w:r>
     </w:p>
     <w:p>
@@ -2391,15 +2301,7 @@
         <w:t>Right to Opt-Out</w:t>
       </w:r>
       <w:r>
-        <w:t xml:space="preserve"> - </w:t>
-      </w:r>
-      <w:proofErr w:type="spellStart"/>
-      <w:r>
-        <w:t>Opt</w:t>
-      </w:r>
-      <w:proofErr w:type="spellEnd"/>
-      <w:r>
-        <w:t xml:space="preserve"> out of the "sale" or "sharing" of personal information (we do not sell or share your data)</w:t>
+        <w:t xml:space="preserve"> - Opt out of the "sale" or "sharing" of personal information (we do not sell or share your data)</w:t>
       </w:r>
     </w:p>
     <w:p>
@@ -2550,10 +2452,7 @@
         <w:pStyle w:val="Heading3"/>
       </w:pPr>
       <w:r>
-        <w:t>7.3 Canadian Residents (PIPEDA Rights)</w:t>
-      </w:r>
-      <w:r>
-        <w:t>; Mexican Residents (ARCO Rights)</w:t>
+        <w:t>7.3 Canadian Residents (PIPEDA Rights); Mexican Residents (ARCO Rights)</w:t>
       </w:r>
     </w:p>
     <w:p>
@@ -2598,16 +2497,7 @@
         </w:numPr>
       </w:pPr>
       <w:r>
-        <w:t>Withdraw consent for certain uses of your data</w:t>
-      </w:r>
-      <w:r>
-        <w:t xml:space="preserve"> </w:t>
-      </w:r>
-      <w:r>
-        <w:t>(</w:t>
-      </w:r>
-      <w:r>
-        <w:t>for example, marketing communications or non-essential analytics), without affecting the core services that are strictly necessary to operate your account and fulfill your requests)</w:t>
+        <w:t>Withdraw consent for certain uses of your data (for example, marketing communications or non-essential analytics), without affecting the core services that are strictly necessary to operate your account and fulfill your requests)</w:t>
       </w:r>
     </w:p>
     <w:p>
@@ -2642,18 +2532,7 @@
         <w:ind w:left="720"/>
       </w:pPr>
       <w:r>
-        <w:t xml:space="preserve">For most of our processing activities, we rely on your consent under PIPEDA. In some cases, we may also process your information </w:t>
-      </w:r>
-      <w:proofErr w:type="gramStart"/>
-      <w:r>
-        <w:t>where</w:t>
-      </w:r>
-      <w:proofErr w:type="gramEnd"/>
-      <w:r>
-        <w:t xml:space="preserve"> permitted without consent, for example to investigate fraud or security incidents, or to comply with legal obligations</w:t>
-      </w:r>
-      <w:r>
-        <w:t>.</w:t>
+        <w:t>For most of our processing activities, we rely on your consent under PIPEDA. In some cases, we may also process your information where permitted without consent, for example to investigate fraud or security incidents, or to comply with legal obligations.</w:t>
       </w:r>
     </w:p>
     <w:p>
@@ -2980,19 +2859,7 @@
         <w:t>strictly intended for users 18 years of age and older</w:t>
       </w:r>
       <w:r>
-        <w:t xml:space="preserve">. We do not knowingly collect personal information from individuals under 18. We verify age through the birth date provided during account registration. If we discover that we have inadvertently collected information from someone under 18, we will promptly delete that information. </w:t>
-      </w:r>
-      <w:r>
-        <w:t>If we become aware of content suggesting abuse, exploitation, or endangerment of a minor, we may retain relevant information and report it to law-enforcement or appropriate authorities, in accordance with applicable law and our legal obligations</w:t>
-      </w:r>
-      <w:r>
-        <w:t>.</w:t>
-      </w:r>
-      <w:r>
-        <w:t xml:space="preserve">  </w:t>
-      </w:r>
-      <w:r>
-        <w:t>If you believe we have collected information from a minor, please contact us immediately at privacy@starshippsychics.com.</w:t>
+        <w:t>. We do not knowingly collect personal information from individuals under 18. We verify age through the birth date provided during account registration. If we discover that we have inadvertently collected information from someone under 18, we will promptly delete that information. If we become aware of content suggesting abuse, exploitation, or endangerment of a minor, we may retain relevant information and report it to law-enforcement or appropriate authorities, in accordance with applicable law and our legal obligations.  If you believe we have collected information from a minor, please contact us immediately at privacy@starshippsychics.com.</w:t>
       </w:r>
     </w:p>
     <w:p>
@@ -3269,10 +3136,7 @@
         <w:pStyle w:val="Heading2"/>
       </w:pPr>
       <w:r>
-        <w:t xml:space="preserve">16. </w:t>
-      </w:r>
-      <w:r>
-        <w:t>Data Breach Notification</w:t>
+        <w:t>16. Data Breach Notification</w:t>
       </w:r>
     </w:p>
     <w:p>
@@ -3293,16 +3157,7 @@
           <w:szCs w:val="24"/>
         </w:rPr>
         <w:lastRenderedPageBreak/>
-        <w:t>I</w:t>
-      </w:r>
-      <w:r>
-        <w:rPr>
-          <w:b w:val="0"/>
-          <w:bCs w:val="0"/>
-          <w:sz w:val="24"/>
-          <w:szCs w:val="24"/>
-        </w:rPr>
-        <w:t>f we become aware of a security incident that compromises the confidentiality, integrity, or availability of your personal information, we will investigate promptly and take reasonable steps to mitigate any harm. Where required by applicable law, we will notify you and/or the appropriate regulatory authorities without undue delay, and will provide information about what happened, what data may be affected, and steps you can take to protect yourself.</w:t>
+        <w:t>If we become aware of a security incident that compromises the confidentiality, integrity, or availability of your personal information, we will investigate promptly and take reasonable steps to mitigate any harm. Where required by applicable law, we will notify you and/or the appropriate regulatory authorities without undue delay, and will provide information about what happened, what data may be affected, and steps you can take to protect yourself.</w:t>
       </w:r>
     </w:p>
     <w:p>
@@ -3326,13 +3181,7 @@
         <w:pStyle w:val="Heading2"/>
       </w:pPr>
       <w:r>
-        <w:t>1</w:t>
-      </w:r>
-      <w:r>
-        <w:t>8</w:t>
-      </w:r>
-      <w:r>
-        <w:t>. Governing Law and Dispute Resolution</w:t>
+        <w:t>18. Governing Law and Dispute Resolution</w:t>
       </w:r>
     </w:p>
     <w:p>
@@ -3378,13 +3227,465 @@
         <w:pStyle w:val="Heading2"/>
       </w:pPr>
       <w:r>
-        <w:t>1</w:t>
-      </w:r>
-      <w:r>
-        <w:t>9</w:t>
-      </w:r>
-      <w:r>
-        <w:t>. Acknowledgment and Consent</w:t>
+        <w:t>20. Brazilian Residents – Lei Geral de Proteção de Dados (LGPD)</w:t>
+      </w:r>
+    </w:p>
+    <w:p>
+      <w:pPr>
+        <w:spacing w:after="160"/>
+      </w:pPr>
+      <w:r>
+        <w:t>If you are located in Brazil, this section applies to you in addition to the rest of this Privacy Policy. Starship Psychics LLC processes the personal data of Brazilian residents in accordance with Brazil’s Lei Geral de Proteção de Dados Pessoais (LGPD), Law No. 13,709/2018, as amended. In the event of any conflict between this section and the rest of this Privacy Policy, this section controls with respect to Brazilian residents.</w:t>
+      </w:r>
+    </w:p>
+    <w:p>
+      <w:pPr>
+        <w:pStyle w:val="Heading3"/>
+      </w:pPr>
+      <w:r>
+        <w:t>20.1 Legal Bases for Processing</w:t>
+      </w:r>
+    </w:p>
+    <w:p>
+      <w:pPr>
+        <w:spacing w:after="160"/>
+      </w:pPr>
+      <w:r>
+        <w:t>Under the LGPD, we must identify a lawful basis for each processing activity. The following table sets out the primary legal basis we rely on for our main processing activities:</w:t>
+      </w:r>
+    </w:p>
+    <w:p>
+      <w:pPr>
+        <w:pStyle w:val="ListParagraph"/>
+        <w:numPr>
+          <w:ilvl w:val="0"/>
+          <w:numId w:val="2"/>
+        </w:numPr>
+      </w:pPr>
+      <w:r>
+        <w:rPr>
+          <w:b/>
+        </w:rPr>
+        <w:t>Account creation and authentication</w:t>
+      </w:r>
+      <w:r>
+        <w:t xml:space="preserve"> – Performance of a contract (Art. 7(V) LGPD)</w:t>
+      </w:r>
+    </w:p>
+    <w:p>
+      <w:pPr>
+        <w:pStyle w:val="ListParagraph"/>
+        <w:numPr>
+          <w:ilvl w:val="0"/>
+          <w:numId w:val="2"/>
+        </w:numPr>
+      </w:pPr>
+      <w:r>
+        <w:rPr>
+          <w:b/>
+        </w:rPr>
+        <w:t>Astrological and oracle services</w:t>
+      </w:r>
+      <w:r>
+        <w:t xml:space="preserve"> – Performance of a contract and, where the service involves sensitive personal data (including spiritual or religious content incidentally shared), explicit consent (Art. 7(V) and Art. 11(I) LGPD)</w:t>
+      </w:r>
+    </w:p>
+    <w:p>
+      <w:pPr>
+        <w:pStyle w:val="ListParagraph"/>
+        <w:numPr>
+          <w:ilvl w:val="0"/>
+          <w:numId w:val="2"/>
+        </w:numPr>
+      </w:pPr>
+      <w:r>
+        <w:rPr>
+          <w:b/>
+        </w:rPr>
+        <w:t>Marketing communications</w:t>
+      </w:r>
+      <w:r>
+        <w:t xml:space="preserve"> – Consent, which you may withdraw at any time without affecting services (Art. 7(I) LGPD)</w:t>
+      </w:r>
+    </w:p>
+    <w:p>
+      <w:pPr>
+        <w:pStyle w:val="ListParagraph"/>
+        <w:numPr>
+          <w:ilvl w:val="0"/>
+          <w:numId w:val="2"/>
+        </w:numPr>
+      </w:pPr>
+      <w:r>
+        <w:rPr>
+          <w:b/>
+        </w:rPr>
+        <w:lastRenderedPageBreak/>
+        <w:t>Fraud prevention and security</w:t>
+      </w:r>
+      <w:r>
+        <w:t xml:space="preserve"> – Legitimate interest of the controller (Art. 7(IX) LGPD)</w:t>
+      </w:r>
+    </w:p>
+    <w:p>
+      <w:pPr>
+        <w:pStyle w:val="ListParagraph"/>
+        <w:numPr>
+          <w:ilvl w:val="0"/>
+          <w:numId w:val="2"/>
+        </w:numPr>
+      </w:pPr>
+      <w:r>
+        <w:rPr>
+          <w:b/>
+        </w:rPr>
+        <w:t>Compliance with legal obligations</w:t>
+      </w:r>
+      <w:r>
+        <w:t xml:space="preserve"> – Compliance with a legal obligation (Art. 7(II) LGPD)</w:t>
+      </w:r>
+    </w:p>
+    <w:p>
+      <w:pPr>
+        <w:pStyle w:val="ListParagraph"/>
+        <w:numPr>
+          <w:ilvl w:val="0"/>
+          <w:numId w:val="2"/>
+        </w:numPr>
+      </w:pPr>
+      <w:r>
+        <w:rPr>
+          <w:b/>
+        </w:rPr>
+        <w:t>Service analytics and improvement</w:t>
+      </w:r>
+      <w:r>
+        <w:t xml:space="preserve"> – Legitimate interest of the controller (Art. 7(IX) LGPD)</w:t>
+      </w:r>
+    </w:p>
+    <w:p>
+      <w:pPr>
+        <w:spacing w:before="160" w:after="160"/>
+      </w:pPr>
+      <w:r>
+        <w:t>Where we rely on consent as the legal basis, you have the right to withdraw that consent at any time. Withdrawal of consent does not affect the lawfulness of processing carried out before withdrawal, nor does it affect processing carried out on other legal bases.</w:t>
+      </w:r>
+    </w:p>
+    <w:p>
+      <w:pPr>
+        <w:pStyle w:val="Heading3"/>
+      </w:pPr>
+      <w:r>
+        <w:t>20.2 Sensitive Personal Data</w:t>
+      </w:r>
+    </w:p>
+    <w:p>
+      <w:pPr>
+        <w:spacing w:after="160"/>
+      </w:pPr>
+      <w:r>
+        <w:t>Under Article 11 of the LGPD, the following categories of data we collect are classified as sensitive personal data and receive enhanced protection:</w:t>
+      </w:r>
+    </w:p>
+    <w:p>
+      <w:pPr>
+        <w:pStyle w:val="ListParagraph"/>
+        <w:numPr>
+          <w:ilvl w:val="0"/>
+          <w:numId w:val="2"/>
+        </w:numPr>
+      </w:pPr>
+      <w:r>
+        <w:rPr>
+          <w:b/>
+        </w:rPr>
+        <w:t>Health and sexual life data</w:t>
+      </w:r>
+      <w:r>
+        <w:t xml:space="preserve"> – Information you may voluntarily share in oracle chat messages</w:t>
+      </w:r>
+    </w:p>
+    <w:p>
+      <w:pPr>
+        <w:pStyle w:val="ListParagraph"/>
+        <w:numPr>
+          <w:ilvl w:val="0"/>
+          <w:numId w:val="2"/>
+        </w:numPr>
+      </w:pPr>
+      <w:r>
+        <w:rPr>
+          <w:b/>
+        </w:rPr>
+        <w:t>Religious or spiritual beliefs</w:t>
+      </w:r>
+      <w:r>
+        <w:t xml:space="preserve"> – Information you may voluntarily share in oracle chat messages or that may be inferred from your use of the Service</w:t>
+      </w:r>
+    </w:p>
+    <w:p>
+      <w:pPr>
+        <w:spacing w:before="120" w:after="160"/>
+      </w:pPr>
+      <w:r>
+        <w:t>We do not request sensitive personal data directly and we do not use it for marketing, profiling, or advertising purposes. We process any sensitive data you share solely to deliver the oracle, horoscope, and related services you request. Your explicit consent to this processing is obtained at account creation and may be withdrawn at any time by deleting your account or contacting us at privacy@starshippsychics.com.</w:t>
+      </w:r>
+    </w:p>
+    <w:p>
+      <w:pPr>
+        <w:pStyle w:val="Heading3"/>
+      </w:pPr>
+      <w:r>
+        <w:t>20.3 Your Rights Under the LGPD</w:t>
+      </w:r>
+    </w:p>
+    <w:p>
+      <w:pPr>
+        <w:spacing w:after="120"/>
+      </w:pPr>
+      <w:r>
+        <w:t>If you are a Brazilian resident, Article 18 of the LGPD grants you the following rights with respect to your personal data:</w:t>
+      </w:r>
+    </w:p>
+    <w:p>
+      <w:pPr>
+        <w:pStyle w:val="ListParagraph"/>
+        <w:numPr>
+          <w:ilvl w:val="0"/>
+          <w:numId w:val="2"/>
+        </w:numPr>
+      </w:pPr>
+      <w:r>
+        <w:rPr>
+          <w:b/>
+        </w:rPr>
+        <w:t>Confirmation and Access</w:t>
+      </w:r>
+      <w:r>
+        <w:t xml:space="preserve"> – Confirm whether we process your personal data and obtain a copy of it (Art. 18(I) and (II))</w:t>
+      </w:r>
+    </w:p>
+    <w:p>
+      <w:pPr>
+        <w:pStyle w:val="ListParagraph"/>
+        <w:numPr>
+          <w:ilvl w:val="0"/>
+          <w:numId w:val="2"/>
+        </w:numPr>
+      </w:pPr>
+      <w:r>
+        <w:rPr>
+          <w:b/>
+        </w:rPr>
+        <w:t>Correction</w:t>
+      </w:r>
+      <w:r>
+        <w:t xml:space="preserve"> – Request correction of incomplete, inaccurate, or outdated data (Art. 18(III))</w:t>
+      </w:r>
+    </w:p>
+    <w:p>
+      <w:pPr>
+        <w:pStyle w:val="ListParagraph"/>
+        <w:numPr>
+          <w:ilvl w:val="0"/>
+          <w:numId w:val="2"/>
+        </w:numPr>
+      </w:pPr>
+      <w:r>
+        <w:rPr>
+          <w:b/>
+        </w:rPr>
+        <w:t>Anonymization, Blocking, or Deletion</w:t>
+      </w:r>
+      <w:r>
+        <w:t xml:space="preserve"> – Request anonymization, blocking, or deletion of unnecessary or excessive data, or data processed in non-compliance with the LGPD (Art. 18(IV))</w:t>
+      </w:r>
+    </w:p>
+    <w:p>
+      <w:pPr>
+        <w:pStyle w:val="ListParagraph"/>
+        <w:numPr>
+          <w:ilvl w:val="0"/>
+          <w:numId w:val="2"/>
+        </w:numPr>
+      </w:pPr>
+      <w:r>
+        <w:rPr>
+          <w:b/>
+        </w:rPr>
+        <w:t>Portability</w:t>
+      </w:r>
+      <w:r>
+        <w:t xml:space="preserve"> – Request transfer of your personal data to another service provider in a structured, machine-readable format (Art. 18(V))</w:t>
+      </w:r>
+    </w:p>
+    <w:p>
+      <w:pPr>
+        <w:pStyle w:val="ListParagraph"/>
+        <w:numPr>
+          <w:ilvl w:val="0"/>
+          <w:numId w:val="2"/>
+        </w:numPr>
+      </w:pPr>
+      <w:r>
+        <w:rPr>
+          <w:b/>
+        </w:rPr>
+        <w:t>Deletion of Consent-Based Data</w:t>
+      </w:r>
+      <w:r>
+        <w:t xml:space="preserve"> – Request deletion of personal data processed on the basis of your consent, except where retention is required by law or legitimate business necessity (Art. 18(VI))</w:t>
+      </w:r>
+    </w:p>
+    <w:p>
+      <w:pPr>
+        <w:pStyle w:val="ListParagraph"/>
+        <w:numPr>
+          <w:ilvl w:val="0"/>
+          <w:numId w:val="2"/>
+        </w:numPr>
+      </w:pPr>
+      <w:r>
+        <w:rPr>
+          <w:b/>
+        </w:rPr>
+        <w:t>Information About Sharing</w:t>
+      </w:r>
+      <w:r>
+        <w:t xml:space="preserve"> – Obtain information about public and private entities with which we have shared your data (Art. 18(VII))</w:t>
+      </w:r>
+    </w:p>
+    <w:p>
+      <w:pPr>
+        <w:pStyle w:val="ListParagraph"/>
+        <w:numPr>
+          <w:ilvl w:val="0"/>
+          <w:numId w:val="2"/>
+        </w:numPr>
+      </w:pPr>
+      <w:r>
+        <w:rPr>
+          <w:b/>
+        </w:rPr>
+        <w:t>Information About Consent Denial</w:t>
+      </w:r>
+      <w:r>
+        <w:t xml:space="preserve"> – Be informed of the consequences of denying consent where consent is the legal basis (Art. 18(VIII))</w:t>
+      </w:r>
+    </w:p>
+    <w:p>
+      <w:pPr>
+        <w:pStyle w:val="ListParagraph"/>
+        <w:numPr>
+          <w:ilvl w:val="0"/>
+          <w:numId w:val="2"/>
+        </w:numPr>
+      </w:pPr>
+      <w:r>
+        <w:rPr>
+          <w:b/>
+        </w:rPr>
+        <w:t>Withdrawal of Consent</w:t>
+      </w:r>
+      <w:r>
+        <w:t xml:space="preserve"> – Revoke consent at any time through a free and facilitated procedure (Art. 18(IX))</w:t>
+      </w:r>
+    </w:p>
+    <w:p>
+      <w:pPr>
+        <w:pStyle w:val="ListParagraph"/>
+        <w:numPr>
+          <w:ilvl w:val="0"/>
+          <w:numId w:val="2"/>
+        </w:numPr>
+      </w:pPr>
+      <w:r>
+        <w:rPr>
+          <w:b/>
+        </w:rPr>
+        <w:lastRenderedPageBreak/>
+        <w:t>Review of Automated Decisions</w:t>
+      </w:r>
+      <w:r>
+        <w:t xml:space="preserve"> – Request review of decisions made solely by automated processing that affect your interests, including a clear explanation of the criteria and procedures used (Art. 20). This right applies to our AI-powered oracle service, which uses automated processing to generate personalized readings.</w:t>
+      </w:r>
+    </w:p>
+    <w:p>
+      <w:pPr>
+        <w:spacing w:before="160" w:after="160"/>
+      </w:pPr>
+      <w:r>
+        <w:rPr>
+          <w:b/>
+        </w:rPr>
+        <w:t xml:space="preserve">Response timeline: </w:t>
+      </w:r>
+      <w:r>
+        <w:t>We will respond to LGPD rights requests within 15 days of receipt, as required by Article 19 of the LGPD. To exercise any of these rights, contact us at privacy@starshippsychics.com or use the self-service tools in your account settings described in Section 7.4.</w:t>
+      </w:r>
+    </w:p>
+    <w:p>
+      <w:pPr>
+        <w:pStyle w:val="Heading3"/>
+      </w:pPr>
+      <w:r>
+        <w:t>20.4 International Data Transfers</w:t>
+      </w:r>
+    </w:p>
+    <w:p>
+      <w:pPr>
+        <w:spacing w:after="160"/>
+      </w:pPr>
+      <w:r>
+        <w:t>Your personal data is processed and stored on servers located in the United States. Transfers of your personal data from Brazil to the United States and to our third-party service providers are conducted in accordance with Chapter V of the LGPD using Standard Contractual Clauses approved by the Autoridade Nacional de Proteção de Dados (ANPD) in our agreements with each service provider. A list of our third-party service providers and the safeguards applicable to each transfer is set out in Section 4 of this Privacy Policy.</w:t>
+      </w:r>
+    </w:p>
+    <w:p>
+      <w:pPr>
+        <w:spacing w:after="160"/>
+      </w:pPr>
+      <w:r>
+        <w:t>You may request a copy of the applicable Standard Contractual Clauses by contacting us at privacy@starshippsychics.com.</w:t>
+      </w:r>
+    </w:p>
+    <w:p>
+      <w:pPr>
+        <w:pStyle w:val="Heading3"/>
+      </w:pPr>
+      <w:r>
+        <w:t>20.5 Data Breach Notification</w:t>
+      </w:r>
+    </w:p>
+    <w:p>
+      <w:pPr>
+        <w:spacing w:after="160"/>
+      </w:pPr>
+      <w:r>
+        <w:t>In the event of a security incident that may result in relevant risk or harm to Brazilian residents, we will notify the ANPD and affected data subjects within three working days of becoming aware that the incident involved personal data, as required by ANPD Resolution CD/ANPD No. 15/2024. The notification will include the nature of the data affected, the categories and number of data subjects concerned, the likely consequences of the incident, and the measures taken or proposed to address it.</w:t>
+      </w:r>
+    </w:p>
+    <w:p>
+      <w:pPr>
+        <w:pStyle w:val="Heading3"/>
+      </w:pPr>
+      <w:r>
+        <w:t>20.6 Complaint to the ANPD</w:t>
+      </w:r>
+    </w:p>
+    <w:p>
+      <w:pPr>
+        <w:spacing w:after="240"/>
+      </w:pPr>
+      <w:r>
+        <w:t>If you believe we have processed your personal data in violation of the LGPD, you have the right to lodge a complaint with the Autoridade Nacional de Proteção de Dados (ANPD) at www.gov.br/anpd. This right exists independently of any other legal remedy available to you.</w:t>
+      </w:r>
+    </w:p>
+    <w:p>
+      <w:pPr>
+        <w:pStyle w:val="Heading2"/>
+      </w:pPr>
+      <w:r>
+        <w:t>19. Acknowledgment and Consent</w:t>
       </w:r>
     </w:p>
     <w:p>
@@ -3466,6 +3767,7 @@
         <w:spacing w:after="240"/>
       </w:pPr>
       <w:r>
+        <w:lastRenderedPageBreak/>
         <w:t>Nothing in this Section limits your statutory rights under applicable privacy laws, including the rights of California, Canadian, and Mexican residents described in Section 7.</w:t>
       </w:r>
     </w:p>
@@ -3520,7 +3822,6 @@
           <w:sz w:val="20"/>
           <w:szCs w:val="20"/>
         </w:rPr>
-        <w:lastRenderedPageBreak/>
         <w:t>This Privacy Policy is a comprehensive compliance document. We recommend periodic review with legal counsel to ensure continued compliance with evolving privacy regulations.</w:t>
       </w:r>
     </w:p>

</xml_diff>